<commit_message>
its been a while
</commit_message>
<xml_diff>
--- a/IT15_PROJECT TITLE PROPOSAL-V3.docx
+++ b/IT15_PROJECT TITLE PROPOSAL-V3.docx
@@ -96,7 +96,6 @@
                 <w:szCs w:val="28"/>
               </w:rPr>
             </w:pPr>
-            <w:proofErr w:type="spellStart"/>
             <w:r>
               <w:rPr>
                 <w:b/>
@@ -159,7 +158,6 @@
               </w:rPr>
               <w:t>i</w:t>
             </w:r>
-            <w:proofErr w:type="spellEnd"/>
             <w:r>
               <w:rPr>
                 <w:b/>
@@ -520,29 +518,13 @@
           </w:tcPr>
           <w:p>
             <w:r>
-              <w:t xml:space="preserve">SAP Business One API, </w:t>
-            </w:r>
-            <w:proofErr w:type="spellStart"/>
-            <w:r>
-              <w:t>PayMongo</w:t>
-            </w:r>
-            <w:proofErr w:type="spellEnd"/>
-            <w:r>
-              <w:t xml:space="preserve"> API,</w:t>
+              <w:t>SAP Business One API, PayMongo API,</w:t>
             </w:r>
             <w:r>
               <w:t xml:space="preserve"> Stripe API,</w:t>
             </w:r>
             <w:r>
-              <w:t xml:space="preserve"> SendGrid API, Random Forest, </w:t>
-            </w:r>
-            <w:proofErr w:type="spellStart"/>
-            <w:r>
-              <w:t>SignalR</w:t>
-            </w:r>
-            <w:proofErr w:type="spellEnd"/>
-            <w:r>
-              <w:t>, Chart.js / Recharts</w:t>
+              <w:t xml:space="preserve"> SendGrid API, Random Forest, SignalR, Chart.js / Recharts</w:t>
             </w:r>
           </w:p>
         </w:tc>
@@ -888,6 +870,7 @@
                 <w:rPr>
                   <w:noProof/>
                 </w:rPr>
+                <w:lastRenderedPageBreak/>
                 <w:drawing>
                   <wp:inline distT="0" distB="0" distL="0" distR="0" wp14:anchorId="2B59C61D" wp14:editId="1BE6BFCC">
                     <wp:extent cx="3144761" cy="1354666"/>
@@ -939,10 +922,6 @@
           </w:p>
           <w:p/>
           <w:p/>
-          <w:p/>
-          <w:p/>
-          <w:p/>
-          <w:p/>
         </w:tc>
       </w:tr>
       <w:tr>
@@ -1017,7 +996,7 @@
       </w:tr>
       <w:tr>
         <w:trPr>
-          <w:trHeight w:val="580"/>
+          <w:trHeight w:val="8287"/>
         </w:trPr>
         <w:tc>
           <w:tcPr>
@@ -1046,7 +1025,6 @@
             <w:pPr>
               <w:jc w:val="both"/>
             </w:pPr>
-            <w:proofErr w:type="spellStart"/>
             <w:r>
               <w:t>Pro</w:t>
             </w:r>
@@ -1069,11 +1047,7 @@
               </w:r>
             </w:del>
             <w:r>
-              <w:t>Li</w:t>
-            </w:r>
-            <w:proofErr w:type="spellEnd"/>
-            <w:r>
-              <w:t xml:space="preserve"> is designed for medium to large-scale industrial companies in manufacturing, construction, and heavy equipment sectors where procurement involves high-volume transactions, multiple vendors, and strict regulatory compliance. Primary users are Procurement Officers and Plant Managers who require a centralized platform to manage supplier relationships, purchasing workflows, and vendor risk. </w:t>
+              <w:t xml:space="preserve">Li is designed for medium to large-scale industrial companies in manufacturing, construction, and heavy equipment sectors where procurement involves high-volume transactions, multiple vendors, and strict regulatory compliance. Primary users are Procurement Officers and Plant Managers who require a centralized platform to manage supplier relationships, purchasing workflows, and vendor risk. </w:t>
             </w:r>
           </w:p>
           <w:p>
@@ -1086,11 +1060,7 @@
               <w:jc w:val="both"/>
             </w:pPr>
             <w:r>
-              <w:t xml:space="preserve">By replacing spreadsheet-based manual procurement processes with an integrated digital platform, </w:t>
-            </w:r>
-            <w:proofErr w:type="spellStart"/>
-            <w:r>
-              <w:t>Pro</w:t>
+              <w:t>By replacing spreadsheet-based manual procurement processes with an integrated digital platform, Pro</w:t>
             </w:r>
             <w:ins w:id="14" w:author="Eli Soroño" w:date="2026-03-25T23:13:00Z">
               <w:r>
@@ -1111,11 +1081,7 @@
               </w:r>
             </w:del>
             <w:r>
-              <w:t>Li</w:t>
-            </w:r>
-            <w:proofErr w:type="spellEnd"/>
-            <w:r>
-              <w:t xml:space="preserve"> aims to reduce procurement cycle times, minimize approval bottlenecks, and proactively flag high-risk vendors before contract award protecting the organization from supply chain disruptions, financial losses, and compliance violations. The Random Forest ML module enables data-driven vendor risk decisions instead of relying solely on subjective evaluations. </w:t>
+              <w:t xml:space="preserve">Li aims to reduce procurement cycle times, minimize approval bottlenecks, and proactively flag high-risk vendors before contract award protecting the organization from supply chain disruptions, financial losses, and compliance violations. The Random Forest ML module enables data-driven vendor risk decisions instead of relying solely on subjective evaluations. </w:t>
             </w:r>
           </w:p>
           <w:p>
@@ -1127,7 +1093,6 @@
             <w:pPr>
               <w:jc w:val="both"/>
             </w:pPr>
-            <w:proofErr w:type="spellStart"/>
             <w:r>
               <w:t>Pro</w:t>
             </w:r>
@@ -1150,19 +1115,7 @@
               </w:r>
             </w:del>
             <w:r>
-              <w:t>Li</w:t>
-            </w:r>
-            <w:proofErr w:type="spellEnd"/>
-            <w:r>
-              <w:t xml:space="preserve"> is built on a full-stack ASP.NET Core 8 Web API + React.js architecture. The backend exposes RESTful APIs consumed by the React frontend, with Microsoft SQL Server as the relational database and Entity Framework Core as the ORM. </w:t>
-            </w:r>
-            <w:proofErr w:type="spellStart"/>
-            <w:r>
-              <w:t>SignalR</w:t>
-            </w:r>
-            <w:proofErr w:type="spellEnd"/>
-            <w:r>
-              <w:t xml:space="preserve"> handles real-time PO status tracking. The Random Forest model is developed using Python (scikit-learn) deployed as a microservice API, trained on vendor performance features such as on-time delivery rate, defect/rejection rate, price variance, compliance violations, and contract fulfillment rate.</w:t>
+              <w:t>Li is built on a full-stack ASP.NET Core 8 Web API + React.js architecture. The backend exposes RESTful APIs consumed by the React frontend, with Microsoft SQL Server as the relational database and Entity Framework Core as the ORM. SignalR handles real-time PO status tracking. The Random Forest model is developed using Python (scikit-learn) deployed as a microservice API, trained on vendor performance features such as on-time delivery rate, defect/rejection rate, price variance, compliance violations, and contract fulfillment rate.</w:t>
             </w:r>
           </w:p>
           <w:p>
@@ -1195,11 +1148,129 @@
                 <w:b/>
               </w:rPr>
             </w:pPr>
-            <w:r>
-              <w:rPr>
-                <w:b/>
-              </w:rPr>
-              <w:lastRenderedPageBreak/>
+          </w:p>
+          <w:p>
+            <w:pPr>
+              <w:rPr>
+                <w:b/>
+              </w:rPr>
+            </w:pPr>
+          </w:p>
+          <w:p>
+            <w:pPr>
+              <w:rPr>
+                <w:b/>
+              </w:rPr>
+            </w:pPr>
+          </w:p>
+          <w:p>
+            <w:pPr>
+              <w:rPr>
+                <w:b/>
+              </w:rPr>
+            </w:pPr>
+          </w:p>
+          <w:p>
+            <w:pPr>
+              <w:rPr>
+                <w:b/>
+              </w:rPr>
+            </w:pPr>
+          </w:p>
+          <w:p>
+            <w:pPr>
+              <w:rPr>
+                <w:b/>
+              </w:rPr>
+            </w:pPr>
+          </w:p>
+          <w:p>
+            <w:pPr>
+              <w:rPr>
+                <w:b/>
+              </w:rPr>
+            </w:pPr>
+          </w:p>
+          <w:p>
+            <w:pPr>
+              <w:rPr>
+                <w:b/>
+              </w:rPr>
+            </w:pPr>
+          </w:p>
+          <w:p>
+            <w:pPr>
+              <w:rPr>
+                <w:b/>
+              </w:rPr>
+            </w:pPr>
+          </w:p>
+          <w:p>
+            <w:pPr>
+              <w:rPr>
+                <w:b/>
+              </w:rPr>
+            </w:pPr>
+          </w:p>
+          <w:p>
+            <w:pPr>
+              <w:rPr>
+                <w:b/>
+              </w:rPr>
+            </w:pPr>
+          </w:p>
+          <w:p>
+            <w:pPr>
+              <w:rPr>
+                <w:b/>
+              </w:rPr>
+            </w:pPr>
+          </w:p>
+          <w:p>
+            <w:pPr>
+              <w:rPr>
+                <w:b/>
+              </w:rPr>
+            </w:pPr>
+          </w:p>
+          <w:p>
+            <w:pPr>
+              <w:rPr>
+                <w:b/>
+              </w:rPr>
+            </w:pPr>
+          </w:p>
+          <w:p>
+            <w:pPr>
+              <w:rPr>
+                <w:b/>
+              </w:rPr>
+            </w:pPr>
+          </w:p>
+          <w:p>
+            <w:pPr>
+              <w:rPr>
+                <w:b/>
+              </w:rPr>
+            </w:pPr>
+          </w:p>
+          <w:p>
+            <w:pPr>
+              <w:rPr>
+                <w:b/>
+              </w:rPr>
+            </w:pPr>
+          </w:p>
+          <w:p>
+            <w:pPr>
+              <w:rPr>
+                <w:b/>
+              </w:rPr>
+            </w:pPr>
+            <w:r>
+              <w:rPr>
+                <w:b/>
+              </w:rPr>
               <w:t>Use Case Diagram</w:t>
             </w:r>
           </w:p>
@@ -1243,9 +1314,10 @@
           </w:p>
           <w:p>
             <w:pPr>
-              <w:jc w:val="center"/>
-              <w:rPr>
-                <w:color w:val="EE0000"/>
+              <w:rPr>
+                <w:rFonts w:ascii="Times New Roman" w:eastAsia="Times New Roman" w:hAnsi="Times New Roman" w:cs="Times New Roman"/>
+                <w:sz w:val="24"/>
+                <w:szCs w:val="24"/>
               </w:rPr>
             </w:pPr>
             <w:ins w:id="20" w:author="Eli Soroño" w:date="2026-03-25T23:14:00Z">
@@ -1333,10 +1405,10 @@
                 <w:color w:val="EE0000"/>
               </w:rPr>
               <w:drawing>
-                <wp:inline distT="0" distB="0" distL="0" distR="0" wp14:anchorId="546DD3F6" wp14:editId="04EAFEDA">
-                  <wp:extent cx="4154259" cy="5672666"/>
-                  <wp:effectExtent l="19050" t="19050" r="17780" b="23495"/>
-                  <wp:docPr id="3" name="Picture 3"/>
+                <wp:inline distT="0" distB="0" distL="0" distR="0" wp14:anchorId="112C2AAE" wp14:editId="0D380D00">
+                  <wp:extent cx="4337050" cy="5611283"/>
+                  <wp:effectExtent l="19050" t="19050" r="25400" b="27940"/>
+                  <wp:docPr id="1" name="Picture 1"/>
                   <wp:cNvGraphicFramePr>
                     <a:graphicFrameLocks xmlns:a="http://schemas.openxmlformats.org/drawingml/2006/main" noChangeAspect="1"/>
                   </wp:cNvGraphicFramePr>
@@ -1344,29 +1416,33 @@
                     <a:graphicData uri="http://schemas.openxmlformats.org/drawingml/2006/picture">
                       <pic:pic xmlns:pic="http://schemas.openxmlformats.org/drawingml/2006/picture">
                         <pic:nvPicPr>
-                          <pic:cNvPr id="3" name="Picture 3"/>
-                          <pic:cNvPicPr/>
+                          <pic:cNvPr id="0" name="Picture 2"/>
+                          <pic:cNvPicPr>
+                            <a:picLocks noChangeAspect="1" noChangeArrowheads="1"/>
+                          </pic:cNvPicPr>
                         </pic:nvPicPr>
                         <pic:blipFill>
-                          <a:blip r:embed="rId7">
+                          <a:blip r:embed="rId7" cstate="print">
                             <a:extLst>
                               <a:ext uri="{28A0092B-C50C-407E-A947-70E740481C1C}">
                                 <a14:useLocalDpi xmlns:a14="http://schemas.microsoft.com/office/drawing/2010/main" val="0"/>
                               </a:ext>
                             </a:extLst>
                           </a:blip>
+                          <a:srcRect/>
                           <a:stretch>
                             <a:fillRect/>
                           </a:stretch>
                         </pic:blipFill>
-                        <pic:spPr>
+                        <pic:spPr bwMode="auto">
                           <a:xfrm>
                             <a:off x="0" y="0"/>
-                            <a:ext cx="4184633" cy="5714143"/>
+                            <a:ext cx="4351815" cy="5630385"/>
                           </a:xfrm>
                           <a:prstGeom prst="rect">
                             <a:avLst/>
                           </a:prstGeom>
+                          <a:noFill/>
                           <a:ln>
                             <a:solidFill>
                               <a:schemeClr val="tx1"/>
@@ -1382,7 +1458,6 @@
           </w:p>
           <w:p>
             <w:pPr>
-              <w:jc w:val="center"/>
               <w:rPr>
                 <w:color w:val="EE0000"/>
               </w:rPr>
@@ -1625,7 +1700,6 @@
               </w:numPr>
             </w:pPr>
             <w:r>
-              <w:lastRenderedPageBreak/>
               <w:t>Configure system settings and approval thresholds</w:t>
             </w:r>
           </w:p>
@@ -1905,19 +1979,7 @@
               <w:rPr>
                 <w:color w:val="000000" w:themeColor="text1"/>
               </w:rPr>
-              <w:t>Process invoice matching against approved P</w:t>
-            </w:r>
-            <w:r>
-              <w:rPr>
-                <w:color w:val="000000" w:themeColor="text1"/>
-              </w:rPr>
-              <w:t>o</w:t>
-            </w:r>
-            <w:r>
-              <w:rPr>
-                <w:color w:val="000000" w:themeColor="text1"/>
-              </w:rPr>
-              <w:t>s</w:t>
+              <w:t>Process invoice matching against approved Pos</w:t>
             </w:r>
           </w:p>
           <w:p>
@@ -1992,21 +2054,7 @@
               <w:rPr>
                 <w:rStyle w:val="Strong"/>
               </w:rPr>
-              <w:t>Accounting (</w:t>
-            </w:r>
-            <w:proofErr w:type="spellStart"/>
-            <w:r>
-              <w:rPr>
-                <w:rStyle w:val="Strong"/>
-              </w:rPr>
-              <w:t>ProcurLi</w:t>
-            </w:r>
-            <w:proofErr w:type="spellEnd"/>
-            <w:r>
-              <w:rPr>
-                <w:rStyle w:val="Strong"/>
-              </w:rPr>
-              <w:t xml:space="preserve"> Internal)</w:t>
+              <w:t>Accounting (ProcurLi Internal)</w:t>
             </w:r>
           </w:p>
           <w:p>
@@ -2117,6 +2165,7 @@
               </w:numPr>
             </w:pPr>
             <w:r>
+              <w:lastRenderedPageBreak/>
               <w:t>Check compliance and policy adherence</w:t>
             </w:r>
           </w:p>
@@ -2424,11 +2473,7 @@
           </w:p>
           <w:p>
             <w:r>
-              <w:t xml:space="preserve">Student’s Signature (after </w:t>
-            </w:r>
-            <w:proofErr w:type="gramStart"/>
-            <w:r>
-              <w:t>feedback</w:t>
+              <w:t>Student’s Signature (after feedback</w:t>
             </w:r>
             <w:r>
               <w:t>ing</w:t>
@@ -2437,11 +2482,7 @@
               <w:t>)</w:t>
             </w:r>
             <w:r>
-              <w:t xml:space="preserve">   </w:t>
-            </w:r>
-            <w:proofErr w:type="gramEnd"/>
-            <w:r>
-              <w:t xml:space="preserve">                    Teacher’s Signature</w:t>
+              <w:t xml:space="preserve">                       Teacher’s Signature</w:t>
             </w:r>
           </w:p>
           <w:p/>
@@ -2511,7 +2552,7 @@
         <v:path o:extrusionok="f" gradientshapeok="t" o:connecttype="rect"/>
         <o:lock v:ext="edit" aspectratio="t"/>
       </v:shapetype>
-      <v:shape id="_x0000_i1264" type="#_x0000_t75" style="width:11.4pt;height:11.4pt" o:bullet="t">
+      <v:shape id="_x0000_i1056" type="#_x0000_t75" style="width:11.4pt;height:11.4pt" o:bullet="t">
         <v:imagedata r:id="rId1" o:title="mso3262"/>
       </v:shape>
     </w:pict>

</xml_diff>